<commit_message>
Contentgids versie 3 (template)
</commit_message>
<xml_diff>
--- a/plugins/linkedin-content-coach/skills/linkedin-content-coach/assets/contentgids-template.docx
+++ b/plugins/linkedin-content-coach/skills/linkedin-content-coach/assets/contentgids-template.docx
@@ -187,8 +187,6 @@
         <w:pict>
           <v:rect style="width:0.0pt;height:1.5pt" o:hr="t" o:hrstd="t" o:hralign="center" fillcolor="#A0A0A0" stroked="f"/>
         </w:pict>
-      </w:r>
-      <w:r>
         <w:pict>
           <v:rect style="width:0.0pt;height:1.5pt" o:hr="t" o:hrstd="t" o:hralign="center" fillcolor="#A0A0A0" stroked="f"/>
         </w:pict>
@@ -290,7 +288,7 @@
         <w:rPr>
           <w:rtl w:val="0"/>
         </w:rPr>
-        <w:t xml:space="preserve">Indien je nog geen klanten hebt zal je moeten vertrekken vanuit een hypotetische situatie. Maak het echter zo concreet mogelijk.</w:t>
+        <w:t xml:space="preserve">Indien je nog geen klanten hebt zal je moeten vertrekken vanuit een hypothetische situatie. Maak het echter zo concreet mogelijk.</w:t>
       </w:r>
     </w:p>
     <w:p>
@@ -345,11 +343,6 @@
         </w:rPr>
         <w:t xml:space="preserve">Geef de naam van de persoon en de functietitel. Wat is de naam van het bedrijf en omschrijf kort wat ze doen. Focus nog niet op jullie samenwerking maar zorg dat iemand die deze persoon niet kent beter begrijpt over wie het gaat.</w:t>
       </w:r>
-      <w:r>
-        <w:rPr>
-          <w:rtl w:val="0"/>
-        </w:rPr>
-      </w:r>
     </w:p>
     <w:p>
       <w:pPr>
@@ -479,13 +472,7 @@
         <w:rPr>
           <w:rtl w:val="0"/>
         </w:rPr>
-        <w:t xml:space="preserve">Aan wie verkoopt je klant</w:t>
-      </w:r>
-      <w:r>
-        <w:rPr>
-          <w:rtl w:val="0"/>
-        </w:rPr>
-        <w:t xml:space="preserve">, en waarom werkte het niet?</w:t>
+        <w:t xml:space="preserve">Aan wie verkoopt je klant, en waarom werkte het niet?</w:t>
       </w:r>
     </w:p>
     <w:p>
@@ -1222,7 +1209,7 @@
           <w:bCs w:val="1"/>
           <w:rtl w:val="0"/>
         </w:rPr>
-        <w:t xml:space="preserve">Answer:</w:t>
+        <w:t xml:space="preserve">Antwoord:</w:t>
       </w:r>
     </w:p>
     <w:p>
@@ -1375,7 +1362,7 @@
         <w:rPr>
           <w:rtl w:val="0"/>
         </w:rPr>
-        <w:t xml:space="preserve">Doorloop stap voor stap hoe het is om met jou te werken, van begin tot eind. Wat gebeurt er in de eerste week? Hoe ziet een typische maand eruit? Wat krijgen mensen, wat ervaren ze, en met wat gaan ze weg? Wees specifiek over het proces, niet alleen over het resultaat.</w:t>
+        <w:t xml:space="preserve">Doorloop stap voor stap hoe het is om met jou te werken, van begin tot eind. Wat gebeurt er in de eerste week? Hoe ziet een typische maand eruit? Wat krijgen mensen, wat ervaren ze, en met wat gaan ze weg? Wees specifiek over het proces, niet alleen over het resultaat. En waarom bied je het op deze manier aan, en niet anders?</w:t>
       </w:r>
     </w:p>
     <w:p>
@@ -2750,30 +2737,28 @@
           <w:szCs w:val="26"/>
         </w:rPr>
       </w:pPr>
-      <w:bookmarkStart w:colFirst="0" w:colLast="0" w:name="_yk5gq6rwd95f" w:id="27"/>
-      <w:bookmarkEnd w:id="27"/>
-      <w:r>
-        <w:rPr>
-          <w:b w:val="1"/>
-          <w:bCs w:val="1"/>
-          <w:color w:val="000000"/>
-          <w:sz w:val="26"/>
-          <w:szCs w:val="26"/>
-          <w:rtl w:val="0"/>
-        </w:rPr>
-        <w:t xml:space="preserve">4.2 Welke obstakels ondervond je bij de opstart?</w:t>
-      </w:r>
-    </w:p>
-    <w:p>
-      <w:pPr>
-        <w:spacing w:after="240" w:before="240" w:lineRule="auto"/>
-        <w:rPr/>
-      </w:pPr>
-      <w:r>
-        <w:rPr>
-          <w:rtl w:val="0"/>
-        </w:rPr>
-        <w:t xml:space="preserve">De echte dingen. Fouten, mislukkingen, slechte beslissingen, dingen waar je niet trots op bent. Wat ben je kwijtgeraakt? Wat moest je opnieuw opbouwen? Wat zou je tegen jezelf zeggen als je terug kon gaan in de tijd?</w:t>
+      <w:r>
+        <w:rPr>
+          <w:b w:val="1"/>
+          <w:bCs w:val="1"/>
+          <w:color w:val="000000"/>
+          <w:sz w:val="26"/>
+          <w:szCs w:val="26"/>
+          <w:rtl w:val="0"/>
+        </w:rPr>
+        <w:t xml:space="preserve">4.2 Wat is het verhaal achter je eerste klant?</w:t>
+      </w:r>
+    </w:p>
+    <w:p>
+      <w:pPr>
+        <w:spacing w:after="240" w:before="240" w:lineRule="auto"/>
+        <w:rPr/>
+      </w:pPr>
+      <w:r>
+        <w:rPr>
+          <w:rtl w:val="0"/>
+        </w:rPr>
+        <w:t xml:space="preserve">Hoe kwam die eerste klant bij je terecht? Hoe verliep het eerste gesprek, wat zei die persoon, en wat voelde je toen je die eerste ja kreeg of die eerste factuur stuurde? Wat heb je van die eerste samenwerking geleerd dat je nu nog altijd meeneemt?</w:t>
       </w:r>
     </w:p>
     <w:p>
@@ -2822,30 +2807,30 @@
           <w:szCs w:val="26"/>
         </w:rPr>
       </w:pPr>
-      <w:bookmarkStart w:colFirst="0" w:colLast="0" w:name="_nsgd9is5x8kt" w:id="28"/>
-      <w:bookmarkEnd w:id="28"/>
-      <w:r>
-        <w:rPr>
-          <w:b w:val="1"/>
-          <w:bCs w:val="1"/>
-          <w:color w:val="000000"/>
-          <w:sz w:val="26"/>
-          <w:szCs w:val="26"/>
-          <w:rtl w:val="0"/>
-        </w:rPr>
-        <w:t xml:space="preserve">4.3 Wat was het keerpunt?</w:t>
-      </w:r>
-    </w:p>
-    <w:p>
-      <w:pPr>
-        <w:spacing w:after="240" w:before="240" w:lineRule="auto"/>
-        <w:rPr/>
-      </w:pPr>
-      <w:r>
-        <w:rPr>
-          <w:rtl w:val="0"/>
-        </w:rPr>
-        <w:t xml:space="preserve">Het moment waarop alles begon te veranderen. Wat gebeurde er? Wat realiseerde je je? Wat deed je daarna anders? Was er een specifieke persoon, conversatie of gebeurtenis die alles veranderde?</w:t>
+      <w:bookmarkStart w:colFirst="0" w:colLast="0" w:name="_yk5gq6rwd95f" w:id="27"/>
+      <w:bookmarkEnd w:id="27"/>
+      <w:r>
+        <w:rPr>
+          <w:b w:val="1"/>
+          <w:bCs w:val="1"/>
+          <w:color w:val="000000"/>
+          <w:sz w:val="26"/>
+          <w:szCs w:val="26"/>
+          <w:rtl w:val="0"/>
+        </w:rPr>
+        <w:t xml:space="preserve">4.3 Welke obstakels ondervond je bij de opstart?</w:t>
+      </w:r>
+    </w:p>
+    <w:p>
+      <w:pPr>
+        <w:spacing w:after="240" w:before="240" w:lineRule="auto"/>
+        <w:rPr/>
+      </w:pPr>
+      <w:r>
+        <w:rPr>
+          <w:rtl w:val="0"/>
+        </w:rPr>
+        <w:t xml:space="preserve">De echte dingen. Fouten, mislukkingen, slechte beslissingen, dingen waar je niet trots op bent. Wat ben je kwijtgeraakt? Wat moest je opnieuw opbouwen? Wat zou je tegen jezelf zeggen als je terug kon gaan in de tijd? Wat was je duurste les, in geld, tijd of klanten? En wat heeft die je uiteindelijk opgeleverd?</w:t>
       </w:r>
     </w:p>
     <w:p>
@@ -2894,30 +2879,28 @@
           <w:szCs w:val="26"/>
         </w:rPr>
       </w:pPr>
-      <w:bookmarkStart w:colFirst="0" w:colLast="0" w:name="_lvyjq2o9udd2" w:id="29"/>
-      <w:bookmarkEnd w:id="29"/>
-      <w:r>
-        <w:rPr>
-          <w:b w:val="1"/>
-          <w:bCs w:val="1"/>
-          <w:color w:val="000000"/>
-          <w:sz w:val="26"/>
-          <w:szCs w:val="26"/>
-          <w:rtl w:val="0"/>
-        </w:rPr>
-        <w:t xml:space="preserve">4.4 Wat geloofde je vroeger dat nu niet (meer) klopt?</w:t>
-      </w:r>
-    </w:p>
-    <w:p>
-      <w:pPr>
-        <w:spacing w:after="240" w:before="240" w:lineRule="auto"/>
-        <w:rPr/>
-      </w:pPr>
-      <w:r>
-        <w:rPr>
-          <w:rtl w:val="0"/>
-        </w:rPr>
-        <w:t xml:space="preserve">Een overtuiging over je werk, je klanten, je industrie of jezelf die achteraf niet waar bleek te zijn. Wat heeft dat veranderd? Wat weet je nu dat je eerder had willen weten? Wat zou je zeggen tegen iemand die nog steeds in die oude overtuiging zit?</w:t>
+      <w:r>
+        <w:rPr>
+          <w:b w:val="1"/>
+          <w:bCs w:val="1"/>
+          <w:color w:val="000000"/>
+          <w:sz w:val="26"/>
+          <w:szCs w:val="26"/>
+          <w:rtl w:val="0"/>
+        </w:rPr>
+        <w:t xml:space="preserve">4.4 Was er een moment dat je bijna wilde stoppen?</w:t>
+      </w:r>
+    </w:p>
+    <w:p>
+      <w:pPr>
+        <w:spacing w:after="240" w:before="240" w:lineRule="auto"/>
+        <w:rPr/>
+      </w:pPr>
+      <w:r>
+        <w:rPr>
+          <w:rtl w:val="0"/>
+        </w:rPr>
+        <w:t xml:space="preserve">Wanneer was dat, en wat was er aan de hand? Wat ging er door je hoofd? Wie of wat hield je tegen? Wat heeft dat moment je geleerd over jezelf of over je zaak?</w:t>
       </w:r>
     </w:p>
     <w:p>
@@ -2966,30 +2949,30 @@
           <w:szCs w:val="26"/>
         </w:rPr>
       </w:pPr>
-      <w:bookmarkStart w:colFirst="0" w:colLast="0" w:name="_fc64fp7jp9eg" w:id="30"/>
-      <w:bookmarkEnd w:id="30"/>
-      <w:r>
-        <w:rPr>
-          <w:b w:val="1"/>
-          <w:bCs w:val="1"/>
-          <w:color w:val="000000"/>
-          <w:sz w:val="26"/>
-          <w:szCs w:val="26"/>
-          <w:rtl w:val="0"/>
-        </w:rPr>
-        <w:t xml:space="preserve">4.5 Hoe ziet je leven en werk er nu uit?</w:t>
-      </w:r>
-    </w:p>
-    <w:p>
-      <w:pPr>
-        <w:spacing w:after="240" w:before="240" w:lineRule="auto"/>
-        <w:rPr/>
-      </w:pPr>
-      <w:r>
-        <w:rPr>
-          <w:rtl w:val="0"/>
-        </w:rPr>
-        <w:t xml:space="preserve">Wees concreet. Hoeveel dagen werk je? Hoe ziet een goede week eruit? Wat heb je gebouwd waar je trots op bent? Waar werk je nog aan?</w:t>
+      <w:bookmarkStart w:colFirst="0" w:colLast="0" w:name="_nsgd9is5x8kt" w:id="28"/>
+      <w:bookmarkEnd w:id="28"/>
+      <w:r>
+        <w:rPr>
+          <w:b w:val="1"/>
+          <w:bCs w:val="1"/>
+          <w:color w:val="000000"/>
+          <w:sz w:val="26"/>
+          <w:szCs w:val="26"/>
+          <w:rtl w:val="0"/>
+        </w:rPr>
+        <w:t xml:space="preserve">4.5 Wat was het keerpunt?</w:t>
+      </w:r>
+    </w:p>
+    <w:p>
+      <w:pPr>
+        <w:spacing w:after="240" w:before="240" w:lineRule="auto"/>
+        <w:rPr/>
+      </w:pPr>
+      <w:r>
+        <w:rPr>
+          <w:rtl w:val="0"/>
+        </w:rPr>
+        <w:t xml:space="preserve">Het moment waarop alles begon te veranderen. Wat gebeurde er? Wat realiseerde je je? Wat deed je daarna anders? Was er een specifieke persoon, conversatie of gebeurtenis die alles veranderde?</w:t>
       </w:r>
     </w:p>
     <w:p>
@@ -3038,6 +3021,150 @@
           <w:szCs w:val="26"/>
         </w:rPr>
       </w:pPr>
+      <w:bookmarkStart w:colFirst="0" w:colLast="0" w:name="_lvyjq2o9udd2" w:id="29"/>
+      <w:bookmarkEnd w:id="29"/>
+      <w:r>
+        <w:rPr>
+          <w:b w:val="1"/>
+          <w:bCs w:val="1"/>
+          <w:color w:val="000000"/>
+          <w:sz w:val="26"/>
+          <w:szCs w:val="26"/>
+          <w:rtl w:val="0"/>
+        </w:rPr>
+        <w:t xml:space="preserve">4.6 Wat geloofde je vroeger dat nu niet (meer) klopt?</w:t>
+      </w:r>
+    </w:p>
+    <w:p>
+      <w:pPr>
+        <w:spacing w:after="240" w:before="240" w:lineRule="auto"/>
+        <w:rPr/>
+      </w:pPr>
+      <w:r>
+        <w:rPr>
+          <w:rtl w:val="0"/>
+        </w:rPr>
+        <w:t xml:space="preserve">Een overtuiging over je werk, je klanten, je industrie of jezelf die achteraf niet waar bleek te zijn. Wat heeft dat veranderd? Wat weet je nu dat je eerder had willen weten? Wat zou je zeggen tegen iemand die nog steeds in die oude overtuiging zit?</w:t>
+      </w:r>
+    </w:p>
+    <w:p>
+      <w:pPr>
+        <w:spacing w:after="240" w:before="240" w:lineRule="auto"/>
+        <w:rPr>
+          <w:b w:val="1"/>
+          <w:bCs w:val="1"/>
+        </w:rPr>
+      </w:pPr>
+      <w:r>
+        <w:rPr>
+          <w:b w:val="1"/>
+          <w:bCs w:val="1"/>
+          <w:rtl w:val="0"/>
+        </w:rPr>
+        <w:t xml:space="preserve">Antwoord:</w:t>
+      </w:r>
+    </w:p>
+    <w:p>
+      <w:pPr>
+        <w:rPr/>
+      </w:pPr>
+      <w:r>
+        <w:pict>
+          <v:rect style="width:0.0pt;height:1.5pt" o:hr="t" o:hrstd="t" o:hralign="center" fillcolor="#A0A0A0" stroked="f"/>
+        </w:pict>
+      </w:r>
+      <w:r>
+        <w:rPr>
+          <w:rtl w:val="0"/>
+        </w:rPr>
+      </w:r>
+    </w:p>
+    <w:p>
+      <w:pPr>
+        <w:pStyle w:val="Heading3"/>
+        <w:keepNext w:val="0"/>
+        <w:keepLines w:val="0"/>
+        <w:spacing w:before="280" w:lineRule="auto"/>
+        <w:rPr>
+          <w:b w:val="1"/>
+          <w:bCs w:val="1"/>
+          <w:color w:val="000000"/>
+          <w:sz w:val="26"/>
+          <w:szCs w:val="26"/>
+        </w:rPr>
+      </w:pPr>
+      <w:bookmarkStart w:colFirst="0" w:colLast="0" w:name="_fc64fp7jp9eg" w:id="30"/>
+      <w:bookmarkEnd w:id="30"/>
+      <w:r>
+        <w:rPr>
+          <w:b w:val="1"/>
+          <w:bCs w:val="1"/>
+          <w:color w:val="000000"/>
+          <w:sz w:val="26"/>
+          <w:szCs w:val="26"/>
+          <w:rtl w:val="0"/>
+        </w:rPr>
+        <w:t xml:space="preserve">4.7 Hoe ziet je leven en werk er nu uit?</w:t>
+      </w:r>
+    </w:p>
+    <w:p>
+      <w:pPr>
+        <w:spacing w:after="240" w:before="240" w:lineRule="auto"/>
+        <w:rPr/>
+      </w:pPr>
+      <w:r>
+        <w:rPr>
+          <w:rtl w:val="0"/>
+        </w:rPr>
+        <w:t xml:space="preserve">Wees concreet. Hoeveel dagen werk je? Hoe ziet een goede week eruit? Wat heb je gebouwd waar je trots op bent? Waar werk je nog aan?</w:t>
+      </w:r>
+    </w:p>
+    <w:p>
+      <w:pPr>
+        <w:spacing w:after="240" w:before="240" w:lineRule="auto"/>
+        <w:rPr>
+          <w:b w:val="1"/>
+          <w:bCs w:val="1"/>
+        </w:rPr>
+      </w:pPr>
+      <w:r>
+        <w:rPr>
+          <w:b w:val="1"/>
+          <w:bCs w:val="1"/>
+          <w:rtl w:val="0"/>
+        </w:rPr>
+        <w:t xml:space="preserve">Antwoord:</w:t>
+      </w:r>
+    </w:p>
+    <w:p>
+      <w:pPr>
+        <w:rPr/>
+      </w:pPr>
+      <w:r>
+        <w:pict>
+          <v:rect style="width:0.0pt;height:1.5pt" o:hr="t" o:hrstd="t" o:hralign="center" fillcolor="#A0A0A0" stroked="f"/>
+        </w:pict>
+      </w:r>
+      <w:r>
+        <w:rPr>
+          <w:rtl w:val="0"/>
+        </w:rPr>
+      </w:r>
+    </w:p>
+    <w:p>
+      <w:pPr>
+        <w:pStyle w:val="Heading3"/>
+        <w:keepNext w:val="0"/>
+        <w:keepLines w:val="0"/>
+        <w:spacing w:before="280" w:lineRule="auto"/>
+        <w:rPr>
+          <w:b w:val="1"/>
+          <w:bCs w:val="1"/>
+          <w:color w:val="000000"/>
+          <w:sz w:val="26"/>
+          <w:szCs w:val="26"/>
+        </w:rPr>
+      </w:pPr>
       <w:bookmarkStart w:colFirst="0" w:colLast="0" w:name="_8of1klcc68oo" w:id="31"/>
       <w:bookmarkEnd w:id="31"/>
       <w:r>
@@ -3049,7 +3176,7 @@
           <w:szCs w:val="26"/>
           <w:rtl w:val="0"/>
         </w:rPr>
-        <w:t xml:space="preserve">4.6 Waarom is dit werk persoonlijk belangrijk voor jou?</w:t>
+        <w:t xml:space="preserve">4.8 Waarom is dit werk persoonlijk belangrijk voor jou?</w:t>
       </w:r>
     </w:p>
     <w:p>
@@ -3425,6 +3552,216 @@
     </w:p>
     <w:p>
       <w:pPr>
+        <w:pStyle w:val="Heading3"/>
+        <w:keepNext w:val="0"/>
+        <w:keepLines w:val="0"/>
+        <w:spacing w:before="280" w:lineRule="auto"/>
+        <w:rPr>
+          <w:b w:val="1"/>
+          <w:bCs w:val="1"/>
+          <w:color w:val="000000"/>
+          <w:sz w:val="26"/>
+          <w:szCs w:val="26"/>
+        </w:rPr>
+      </w:pPr>
+      <w:r>
+        <w:rPr>
+          <w:b w:val="1"/>
+          <w:bCs w:val="1"/>
+          <w:color w:val="000000"/>
+          <w:sz w:val="26"/>
+          <w:szCs w:val="26"/>
+          <w:rtl w:val="0"/>
+        </w:rPr>
+        <w:t xml:space="preserve">5.5 Wat was je beste maand tot nu toe?</w:t>
+      </w:r>
+    </w:p>
+    <w:p>
+      <w:pPr>
+        <w:spacing w:after="240" w:before="240" w:lineRule="auto"/>
+        <w:rPr/>
+      </w:pPr>
+      <w:r>
+        <w:rPr>
+          <w:rtl w:val="0"/>
+        </w:rPr>
+        <w:t xml:space="preserve">Welke maand was het, en wat maakte ze zo goed: klanten, omzet, energie, een doorbraak? Wat deed je toen anders dan in andere maanden? Of net niet anders? Wat kun je daarvan herhalen?</w:t>
+      </w:r>
+    </w:p>
+    <w:p>
+      <w:pPr>
+        <w:spacing w:after="240" w:before="240" w:lineRule="auto"/>
+        <w:rPr>
+          <w:b w:val="1"/>
+          <w:bCs w:val="1"/>
+        </w:rPr>
+      </w:pPr>
+      <w:r>
+        <w:rPr>
+          <w:b w:val="1"/>
+          <w:bCs w:val="1"/>
+          <w:rtl w:val="0"/>
+        </w:rPr>
+        <w:t xml:space="preserve">Antwoord:</w:t>
+      </w:r>
+    </w:p>
+    <w:p>
+      <w:pPr>
+        <w:rPr/>
+      </w:pPr>
+      <w:r>
+        <w:pict>
+          <v:rect style="width:0.0pt;height:1.5pt" o:hr="t" o:hrstd="t" o:hralign="center" fillcolor="#A0A0A0" stroked="f"/>
+        </w:pict>
+      </w:r>
+      <w:r>
+        <w:rPr>
+          <w:rtl w:val="0"/>
+        </w:rPr>
+      </w:r>
+    </w:p>
+    <w:p>
+      <w:pPr>
+        <w:pStyle w:val="Heading3"/>
+        <w:keepNext w:val="0"/>
+        <w:keepLines w:val="0"/>
+        <w:spacing w:before="280" w:lineRule="auto"/>
+        <w:rPr>
+          <w:b w:val="1"/>
+          <w:bCs w:val="1"/>
+          <w:color w:val="000000"/>
+          <w:sz w:val="26"/>
+          <w:szCs w:val="26"/>
+        </w:rPr>
+      </w:pPr>
+      <w:r>
+        <w:rPr>
+          <w:b w:val="1"/>
+          <w:bCs w:val="1"/>
+          <w:color w:val="000000"/>
+          <w:sz w:val="26"/>
+          <w:szCs w:val="26"/>
+          <w:rtl w:val="0"/>
+        </w:rPr>
+        <w:t xml:space="preserve">5.6 Wat doe je nooit meer, en waarom?</w:t>
+      </w:r>
+    </w:p>
+    <w:p>
+      <w:pPr>
+        <w:spacing w:after="240" w:before="240" w:lineRule="auto"/>
+        <w:rPr/>
+      </w:pPr>
+      <w:r>
+        <w:rPr>
+          <w:rtl w:val="0"/>
+        </w:rPr>
+        <w:t xml:space="preserve">Een aanpak, een type klant, een gewoonte of een tool waarmee je bewust gestopt bent. Wanneer besliste je om ermee te stoppen, en wat gaf de doorslag? Wat kostte het je, en wat doe je nu in de plaats?</w:t>
+      </w:r>
+    </w:p>
+    <w:p>
+      <w:pPr>
+        <w:spacing w:after="240" w:before="240" w:lineRule="auto"/>
+        <w:rPr>
+          <w:b w:val="1"/>
+          <w:bCs w:val="1"/>
+        </w:rPr>
+      </w:pPr>
+      <w:r>
+        <w:rPr>
+          <w:b w:val="1"/>
+          <w:bCs w:val="1"/>
+          <w:rtl w:val="0"/>
+        </w:rPr>
+        <w:t xml:space="preserve">Antwoord:</w:t>
+      </w:r>
+    </w:p>
+    <w:p>
+      <w:pPr>
+        <w:rPr/>
+      </w:pPr>
+      <w:r>
+        <w:pict>
+          <v:rect style="width:0.0pt;height:1.5pt" o:hr="t" o:hrstd="t" o:hralign="center" fillcolor="#A0A0A0" stroked="f"/>
+        </w:pict>
+      </w:r>
+      <w:r>
+        <w:rPr>
+          <w:rtl w:val="0"/>
+        </w:rPr>
+      </w:r>
+    </w:p>
+    <w:p>
+      <w:pPr>
+        <w:pStyle w:val="Heading3"/>
+        <w:keepNext w:val="0"/>
+        <w:keepLines w:val="0"/>
+        <w:spacing w:before="280" w:lineRule="auto"/>
+        <w:rPr>
+          <w:b w:val="1"/>
+          <w:bCs w:val="1"/>
+          <w:color w:val="000000"/>
+          <w:sz w:val="26"/>
+          <w:szCs w:val="26"/>
+        </w:rPr>
+      </w:pPr>
+      <w:r>
+        <w:rPr>
+          <w:b w:val="1"/>
+          <w:bCs w:val="1"/>
+          <w:color w:val="000000"/>
+          <w:sz w:val="26"/>
+          <w:szCs w:val="26"/>
+          <w:rtl w:val="0"/>
+        </w:rPr>
+        <w:t xml:space="preserve">5.7 Wat gebeurt er deze maand achter de schermen?</w:t>
+      </w:r>
+    </w:p>
+    <w:p>
+      <w:pPr>
+        <w:spacing w:after="240" w:before="240" w:lineRule="auto"/>
+        <w:rPr/>
+      </w:pPr>
+      <w:r>
+        <w:rPr>
+          <w:rtl w:val="0"/>
+        </w:rPr>
+        <w:t xml:space="preserve">Wat klanten en volgers niet zien: waaraan je werkt, hoe een gewone werkweek eruitziet, welke tools en gewoontes je gebruikt, wat je aan het testen bent. Ook de saaie of rommelige kant mag erin.</w:t>
+      </w:r>
+    </w:p>
+    <w:p>
+      <w:pPr>
+        <w:spacing w:after="240" w:before="240" w:lineRule="auto"/>
+        <w:rPr>
+          <w:b w:val="1"/>
+          <w:bCs w:val="1"/>
+        </w:rPr>
+      </w:pPr>
+      <w:r>
+        <w:rPr>
+          <w:b w:val="1"/>
+          <w:bCs w:val="1"/>
+          <w:rtl w:val="0"/>
+        </w:rPr>
+        <w:t xml:space="preserve">Antwoord:</w:t>
+      </w:r>
+    </w:p>
+    <w:p>
+      <w:pPr>
+        <w:rPr/>
+      </w:pPr>
+      <w:r>
+        <w:pict>
+          <v:rect style="width:0.0pt;height:1.5pt" o:hr="t" o:hrstd="t" o:hralign="center" fillcolor="#A0A0A0" stroked="f"/>
+        </w:pict>
+      </w:r>
+      <w:r>
+        <w:rPr>
+          <w:rtl w:val="0"/>
+        </w:rPr>
+      </w:r>
+    </w:p>
+    <w:p>
+      <w:pPr>
         <w:pStyle w:val="Heading2"/>
         <w:keepNext w:val="0"/>
         <w:keepLines w:val="0"/>
@@ -3571,7 +3908,7 @@
         <w:rPr>
           <w:rtl w:val="0"/>
         </w:rPr>
-        <w:t xml:space="preserve">De standaardadviezen in je vakgebied waarvan jij denkt dat ze fout, verouderd of zelfs schadelijk zijn. De “best practices” die eigenlijk niet werken. Wees specifiek: wat is het, waarom geloven de meeste mensen het, en waarvan denk jij dat wel klopt? Geef een voorbeeld als dat kan.</w:t>
+        <w:t xml:space="preserve">De standaardadviezen in je vakgebied waarvan jij denkt dat ze fout, verouderd of zelfs schadelijk zijn. De “best practices” die eigenlijk niet werken. Wees specifiek: wat is het, waarom geloven de meeste mensen het, en waarvan denk jij dat wel klopt? Geef een voorbeeld als dat kan. En welke sterke of controversiële meningen heb je over ondernemen in het algemeen?</w:t>
       </w:r>
     </w:p>
     <w:p>
@@ -3620,30 +3957,28 @@
           <w:szCs w:val="26"/>
         </w:rPr>
       </w:pPr>
-      <w:bookmarkStart w:colFirst="0" w:colLast="0" w:name="_jyyb7188w0wu" w:id="40"/>
-      <w:bookmarkEnd w:id="40"/>
-      <w:r>
-        <w:rPr>
-          <w:b w:val="1"/>
-          <w:bCs w:val="1"/>
-          <w:color w:val="000000"/>
-          <w:sz w:val="26"/>
-          <w:szCs w:val="26"/>
-          <w:rtl w:val="0"/>
-        </w:rPr>
-        <w:t xml:space="preserve">6.3 Wat zeg je tijdens een sales gesprek dat altijd goed aanslaat/landt?</w:t>
-      </w:r>
-    </w:p>
-    <w:p>
-      <w:pPr>
-        <w:spacing w:after="240" w:before="240" w:lineRule="auto"/>
-        <w:rPr/>
-      </w:pPr>
-      <w:r>
-        <w:rPr>
-          <w:rtl w:val="0"/>
-        </w:rPr>
-        <w:t xml:space="preserve">Een specifieke zin, een herformulering, een vraag die je stelt. Iets waardoor mensen zeggen: “ja, precies dat” of stilvallen omdat je de kern raakt. Schrijf het letterlijk op.</w:t>
+      <w:r>
+        <w:rPr>
+          <w:b w:val="1"/>
+          <w:bCs w:val="1"/>
+          <w:color w:val="000000"/>
+          <w:sz w:val="26"/>
+          <w:szCs w:val="26"/>
+          <w:rtl w:val="0"/>
+        </w:rPr>
+        <w:t xml:space="preserve">6.3 Wat is de grootste fout die je ideale klant maakt?</w:t>
+      </w:r>
+    </w:p>
+    <w:p>
+      <w:pPr>
+        <w:spacing w:after="240" w:before="240" w:lineRule="auto"/>
+        <w:rPr/>
+      </w:pPr>
+      <w:r>
+        <w:rPr>
+          <w:rtl w:val="0"/>
+        </w:rPr>
+        <w:t xml:space="preserve">Een fout die je steeds opnieuw ziet bij je doelgroep, vaak al voor ze bij jou komen. Waarom maken ze die fout? Wat kost die hen? En wat zou jij hen in de plaats aanraden? Geef een voorbeeld als dat kan.</w:t>
       </w:r>
     </w:p>
     <w:p>
@@ -3692,30 +4027,28 @@
           <w:szCs w:val="26"/>
         </w:rPr>
       </w:pPr>
-      <w:bookmarkStart w:colFirst="0" w:colLast="0" w:name="_inot9qmgg5ak" w:id="41"/>
-      <w:bookmarkEnd w:id="41"/>
-      <w:r>
-        <w:rPr>
-          <w:b w:val="1"/>
-          <w:bCs w:val="1"/>
-          <w:color w:val="000000"/>
-          <w:sz w:val="26"/>
-          <w:szCs w:val="26"/>
-          <w:rtl w:val="0"/>
-        </w:rPr>
-        <w:t xml:space="preserve">6.4 Welk verhaal uit je eigen ervaring herkent je ideale klant meteen?</w:t>
-      </w:r>
-    </w:p>
-    <w:p>
-      <w:pPr>
-        <w:spacing w:after="240" w:before="240" w:lineRule="auto"/>
-        <w:rPr/>
-      </w:pPr>
-      <w:r>
-        <w:rPr>
-          <w:rtl w:val="0"/>
-        </w:rPr>
-        <w:t xml:space="preserve">Geen les. Een moment. Iets dat jou is overkomen: een specifieke situatie, een gesprek, een fout, een inzicht. Beschrijf het alsof je het aan een vriend vertelt tijdens het eten. Wat gebeurde er, wanneer, wat voelde je, wat veranderde er?</w:t>
+      <w:r>
+        <w:rPr>
+          <w:b w:val="1"/>
+          <w:bCs w:val="1"/>
+          <w:color w:val="000000"/>
+          <w:sz w:val="26"/>
+          <w:szCs w:val="26"/>
+          <w:rtl w:val="0"/>
+        </w:rPr>
+        <w:t xml:space="preserve">6.4 Wat moeten je klanten horen, ook als ze het niet willen horen?</w:t>
+      </w:r>
+    </w:p>
+    <w:p>
+      <w:pPr>
+        <w:spacing w:after="240" w:before="240" w:lineRule="auto"/>
+        <w:rPr/>
+      </w:pPr>
+      <w:r>
+        <w:rPr>
+          <w:rtl w:val="0"/>
+        </w:rPr>
+        <w:t xml:space="preserve">Een ongemakkelijke waarheid over hun situatie, hun aanpak of hun verwachtingen. Wat zeg je tegen een klant als je volledig eerlijk mag zijn? Hoe reageren ze meestal, en waarom is het toch belangrijk dat ze het horen?</w:t>
       </w:r>
     </w:p>
     <w:p>
@@ -3764,6 +4097,220 @@
           <w:szCs w:val="26"/>
         </w:rPr>
       </w:pPr>
+      <w:bookmarkStart w:colFirst="0" w:colLast="0" w:name="_jyyb7188w0wu" w:id="40"/>
+      <w:bookmarkEnd w:id="40"/>
+      <w:r>
+        <w:rPr>
+          <w:b w:val="1"/>
+          <w:bCs w:val="1"/>
+          <w:color w:val="000000"/>
+          <w:sz w:val="26"/>
+          <w:szCs w:val="26"/>
+          <w:rtl w:val="0"/>
+        </w:rPr>
+        <w:t xml:space="preserve">6.5 Wat zeg je tijdens een sales gesprek dat altijd goed aanslaat/landt?</w:t>
+      </w:r>
+    </w:p>
+    <w:p>
+      <w:pPr>
+        <w:spacing w:after="240" w:before="240" w:lineRule="auto"/>
+        <w:rPr/>
+      </w:pPr>
+      <w:r>
+        <w:rPr>
+          <w:rtl w:val="0"/>
+        </w:rPr>
+        <w:t xml:space="preserve">Een specifieke zin, een herformulering, een vraag die je stelt. Iets waardoor mensen zeggen: “ja, precies dat” of stilvallen omdat je de kern raakt. Schrijf het letterlijk op.</w:t>
+      </w:r>
+    </w:p>
+    <w:p>
+      <w:pPr>
+        <w:spacing w:after="240" w:before="240" w:lineRule="auto"/>
+        <w:rPr>
+          <w:b w:val="1"/>
+          <w:bCs w:val="1"/>
+        </w:rPr>
+      </w:pPr>
+      <w:r>
+        <w:rPr>
+          <w:b w:val="1"/>
+          <w:bCs w:val="1"/>
+          <w:rtl w:val="0"/>
+        </w:rPr>
+        <w:t xml:space="preserve">Antwoord:</w:t>
+      </w:r>
+    </w:p>
+    <w:p>
+      <w:pPr>
+        <w:rPr/>
+      </w:pPr>
+      <w:r>
+        <w:pict>
+          <v:rect style="width:0.0pt;height:1.5pt" o:hr="t" o:hrstd="t" o:hralign="center" fillcolor="#A0A0A0" stroked="f"/>
+        </w:pict>
+      </w:r>
+      <w:r>
+        <w:rPr>
+          <w:rtl w:val="0"/>
+        </w:rPr>
+      </w:r>
+    </w:p>
+    <w:p>
+      <w:pPr>
+        <w:pStyle w:val="Heading3"/>
+        <w:keepNext w:val="0"/>
+        <w:keepLines w:val="0"/>
+        <w:spacing w:before="280" w:lineRule="auto"/>
+        <w:rPr>
+          <w:b w:val="1"/>
+          <w:bCs w:val="1"/>
+          <w:color w:val="000000"/>
+          <w:sz w:val="26"/>
+          <w:szCs w:val="26"/>
+        </w:rPr>
+      </w:pPr>
+      <w:bookmarkStart w:colFirst="0" w:colLast="0" w:name="_inot9qmgg5ak" w:id="41"/>
+      <w:bookmarkEnd w:id="41"/>
+      <w:r>
+        <w:rPr>
+          <w:b w:val="1"/>
+          <w:bCs w:val="1"/>
+          <w:color w:val="000000"/>
+          <w:sz w:val="26"/>
+          <w:szCs w:val="26"/>
+          <w:rtl w:val="0"/>
+        </w:rPr>
+        <w:t xml:space="preserve">6.6 Welk verhaal uit je eigen ervaring herkent je ideale klant meteen?</w:t>
+      </w:r>
+    </w:p>
+    <w:p>
+      <w:pPr>
+        <w:spacing w:after="240" w:before="240" w:lineRule="auto"/>
+        <w:rPr/>
+      </w:pPr>
+      <w:r>
+        <w:rPr>
+          <w:rtl w:val="0"/>
+        </w:rPr>
+        <w:t xml:space="preserve">Geen les. Een moment. Iets dat jou is overkomen: een specifieke situatie, een gesprek, een fout, een inzicht. Beschrijf het alsof je het aan een vriend vertelt tijdens het eten. Wat gebeurde er, wanneer, wat voelde je, wat veranderde er?</w:t>
+      </w:r>
+    </w:p>
+    <w:p>
+      <w:pPr>
+        <w:spacing w:after="240" w:before="240" w:lineRule="auto"/>
+        <w:rPr>
+          <w:b w:val="1"/>
+          <w:bCs w:val="1"/>
+        </w:rPr>
+      </w:pPr>
+      <w:r>
+        <w:rPr>
+          <w:b w:val="1"/>
+          <w:bCs w:val="1"/>
+          <w:rtl w:val="0"/>
+        </w:rPr>
+        <w:t xml:space="preserve">Antwoord:</w:t>
+      </w:r>
+    </w:p>
+    <w:p>
+      <w:pPr>
+        <w:rPr/>
+      </w:pPr>
+      <w:r>
+        <w:pict>
+          <v:rect style="width:0.0pt;height:1.5pt" o:hr="t" o:hrstd="t" o:hralign="center" fillcolor="#A0A0A0" stroked="f"/>
+        </w:pict>
+      </w:r>
+      <w:r>
+        <w:rPr>
+          <w:rtl w:val="0"/>
+        </w:rPr>
+      </w:r>
+    </w:p>
+    <w:p>
+      <w:pPr>
+        <w:pStyle w:val="Heading3"/>
+        <w:keepNext w:val="0"/>
+        <w:keepLines w:val="0"/>
+        <w:spacing w:before="280" w:lineRule="auto"/>
+        <w:rPr>
+          <w:b w:val="1"/>
+          <w:bCs w:val="1"/>
+          <w:color w:val="000000"/>
+          <w:sz w:val="26"/>
+          <w:szCs w:val="26"/>
+        </w:rPr>
+      </w:pPr>
+      <w:r>
+        <w:rPr>
+          <w:b w:val="1"/>
+          <w:bCs w:val="1"/>
+          <w:color w:val="000000"/>
+          <w:sz w:val="26"/>
+          <w:szCs w:val="26"/>
+          <w:rtl w:val="0"/>
+        </w:rPr>
+        <w:t xml:space="preserve">6.7 Wat is je missie?</w:t>
+      </w:r>
+    </w:p>
+    <w:p>
+      <w:pPr>
+        <w:spacing w:after="240" w:before="240" w:lineRule="auto"/>
+        <w:rPr/>
+      </w:pPr>
+      <w:r>
+        <w:rPr>
+          <w:rtl w:val="0"/>
+        </w:rPr>
+        <w:t xml:space="preserve">Wat wil je veranderen in je vakgebied of bij je klanten? Hoe ziet dat er over vijf jaar uit als het lukt, en welke rol speel jij daarin? Geen slogan, maar hoe je het zou uitleggen aan iemand die er echt in geïnteresseerd is.</w:t>
+      </w:r>
+    </w:p>
+    <w:p>
+      <w:pPr>
+        <w:spacing w:after="240" w:before="240" w:lineRule="auto"/>
+        <w:rPr>
+          <w:b w:val="1"/>
+          <w:bCs w:val="1"/>
+        </w:rPr>
+      </w:pPr>
+      <w:r>
+        <w:rPr>
+          <w:b w:val="1"/>
+          <w:bCs w:val="1"/>
+          <w:rtl w:val="0"/>
+        </w:rPr>
+        <w:t xml:space="preserve">Antwoord:</w:t>
+      </w:r>
+    </w:p>
+    <w:p>
+      <w:pPr>
+        <w:rPr/>
+      </w:pPr>
+      <w:r>
+        <w:pict>
+          <v:rect style="width:0.0pt;height:1.5pt" o:hr="t" o:hrstd="t" o:hralign="center" fillcolor="#A0A0A0" stroked="f"/>
+        </w:pict>
+      </w:r>
+      <w:r>
+        <w:rPr>
+          <w:rtl w:val="0"/>
+        </w:rPr>
+      </w:r>
+    </w:p>
+    <w:p>
+      <w:pPr>
+        <w:pStyle w:val="Heading3"/>
+        <w:keepNext w:val="0"/>
+        <w:keepLines w:val="0"/>
+        <w:spacing w:before="280" w:lineRule="auto"/>
+        <w:rPr>
+          <w:b w:val="1"/>
+          <w:bCs w:val="1"/>
+          <w:color w:val="000000"/>
+          <w:sz w:val="26"/>
+          <w:szCs w:val="26"/>
+        </w:rPr>
+      </w:pPr>
       <w:bookmarkStart w:colFirst="0" w:colLast="0" w:name="_lrucw5e0rlbn" w:id="42"/>
       <w:bookmarkEnd w:id="42"/>
       <w:r>
@@ -3775,7 +4322,7 @@
           <w:szCs w:val="26"/>
           <w:rtl w:val="0"/>
         </w:rPr>
-        <w:t xml:space="preserve">6.5 Wat is het enige dat je wilt dat mensen onthouden over werken met jou?</w:t>
+        <w:t xml:space="preserve">6.8 Wat is het enige dat je wilt dat mensen onthouden over werken met jou?</w:t>
       </w:r>
     </w:p>
     <w:p>
@@ -3932,7 +4479,7 @@
         <w:rPr>
           <w:rtl w:val="0"/>
         </w:rPr>
-        <w:t xml:space="preserve">Plan een gesprek in met één van je favoriete klanten die je ICP vertegenwoordigd. Stel vragen van onderdeeld (1) en neem deze vragen op.</w:t>
+        <w:t xml:space="preserve">Plan een gesprek in met één van je favoriete klanten die je ICP vertegenwoordigt. Stel vragen van onderdeel (1) en neem deze vragen op.</w:t>
       </w:r>
     </w:p>
     <w:p>

</xml_diff>